<commit_message>
mar: add area de estudo
</commit_message>
<xml_diff>
--- a/docs/index.docx
+++ b/docs/index.docx
@@ -7,7 +7,7 @@
         <w:pStyle w:val="Ttulo"/>
       </w:pPr>
       <w:r>
-        <w:t xml:space="preserve">PADRÕES DE ESTRUTURA E DIVERSIDADE DA COMUNIDADE ZOOPLANCTÔNICA EM UM AMBIENTE AQUÁTICO TEMPORÁRIO DO SEMIÁRIDO BRASILEIRO</w:t>
+        <w:t xml:space="preserve">Padrões de estrutura e diversidade da comunidade zooplanctônica em um ambiente aquático temporário do semiárido Brasileiro</w:t>
       </w:r>
     </w:p>
     <w:p>
@@ -75,7 +75,7 @@
         <w:pStyle w:val="Data"/>
       </w:pPr>
       <w:r>
-        <w:t xml:space="preserve">2026-09-01</w:t>
+        <w:t xml:space="preserve">2026-09-02</w:t>
       </w:r>
     </w:p>
     <w:p>
@@ -463,20 +463,16 @@
         <w:pStyle w:val="Corpodetexto"/>
       </w:pPr>
       <w:r>
-        <w:t xml:space="preserve">Apesar da reconhecida importância ecológica das lagoas temporárias e do zooplâncton como grupo modelo, ainda são escassos os estudos que integram, de forma sistemática, a estrutura da comunidade, a partição da diversidade e as variáveis ambientais ao longo do ciclo hidrológico em regiões semiáridas brasileiras (Medeiros</w:t>
-      </w:r>
-      <w:r>
-        <w:t xml:space="preserve"> </w:t>
-      </w:r>
-      <w:r>
-        <w:rPr>
-          <w:i/>
-          <w:iCs/>
-        </w:rPr>
-        <w:t xml:space="preserve">et al</w:t>
-      </w:r>
-      <w:r>
-        <w:t xml:space="preserve">., 2008; Melo e Medeiros, 2013). Diante desse contexto, o presente estudo tem como objetivo avaliar a estrutura da comunidade zooplanctônica e os padrões de partição da diversidade em lagoas temporárias do semiárido brasileiro, analisando a influência das variações ambientais associadas ao regime hidrológico sazonal.</w:t>
+        <w:t xml:space="preserve">Apesar da reconhecida importância ecológica das lagoas temporárias e do zooplâncton como grupo modelo, ainda são escassos os estudos que integram, de forma sistemática, a estrutura da comunidade, a partição da diversidade e as variáveis ambientais ao longo do ciclo hidrológico em regiões semiáridas brasileiras</w:t>
+      </w:r>
+      <w:r>
+        <w:t xml:space="preserve"> </w:t>
+      </w:r>
+      <w:r>
+        <w:t xml:space="preserve">(Medeiros et al., 2008; Melo &amp; Medeiros, 2013)</w:t>
+      </w:r>
+      <w:r>
+        <w:t xml:space="preserve">. Diante desse contexto, o presente estudo tem como objetivo avaliar a estrutura da comunidade zooplanctônica e os padrões de partição da diversidade em lagoas temporárias do semiárido brasileiro, analisando a influência das variações ambientais associadas ao regime hidrológico sazonal.</w:t>
       </w:r>
     </w:p>
     <w:p>
@@ -499,13 +495,94 @@
       </w:r>
     </w:p>
     <w:bookmarkEnd w:id="20"/>
-    <w:bookmarkStart w:id="25" w:name="material-and-methods"/>
+    <w:bookmarkStart w:id="21" w:name="objectives"/>
     <w:p>
       <w:pPr>
         <w:pStyle w:val="Ttulo1"/>
       </w:pPr>
       <w:r>
-        <w:t xml:space="preserve">2. Material and Methods</w:t>
+        <w:t xml:space="preserve">2. Objectives</w:t>
+      </w:r>
+    </w:p>
+    <w:p>
+      <w:pPr>
+        <w:pStyle w:val="FirstParagraph"/>
+      </w:pPr>
+      <w:r>
+        <w:t xml:space="preserve">Avaliar a estrutura e a diversidade da comunidade zooplanctônica em uma lagoa temporária, analisando sua relação com as variáveis ambientais, utilizando descritores ecológicos e a partição aditiva e multiplicativa da diversidade para compreender a organização da diversidade zooplanctônica em diferentes escalas espaciais.</w:t>
+      </w:r>
+    </w:p>
+    <w:p>
+      <w:pPr>
+        <w:pStyle w:val="Corpodetexto"/>
+      </w:pPr>
+      <w:r>
+        <w:t xml:space="preserve">Objetivos específicos:</w:t>
+      </w:r>
+    </w:p>
+    <w:p>
+      <w:pPr>
+        <w:numPr>
+          <w:ilvl w:val="0"/>
+          <w:numId w:val="1001"/>
+        </w:numPr>
+      </w:pPr>
+      <w:r>
+        <w:t xml:space="preserve">Quantificar as variações espaciais e temporais da diversidade zooplanctônica, decomposta em componentes α, β e γ, por meio da aplicação da partição aditiva e multiplicativa da diversidade em diferentes escalas espaciais.</w:t>
+      </w:r>
+    </w:p>
+    <w:p>
+      <w:pPr>
+        <w:numPr>
+          <w:ilvl w:val="0"/>
+          <w:numId w:val="1001"/>
+        </w:numPr>
+      </w:pPr>
+      <w:r>
+        <w:t xml:space="preserve">Analisar a relação entre a estrutura da comunidade zooplanctônica e as variáveis ambientais físicas, químicas, estruturais e antrópicas, identificando os principais fatores associados à organização da diversidade e da composição de espécies.</w:t>
+      </w:r>
+    </w:p>
+    <w:p>
+      <w:pPr>
+        <w:numPr>
+          <w:ilvl w:val="0"/>
+          <w:numId w:val="1001"/>
+        </w:numPr>
+      </w:pPr>
+      <w:r>
+        <w:t xml:space="preserve">Identificar espécies indicadoras da comunidade zooplanctônica associadas a diferentes condições ambientais e hidrológicas da lagoa temporária, com base em padrões de ocorrência e abundância.</w:t>
+      </w:r>
+    </w:p>
+    <w:p>
+      <w:pPr>
+        <w:numPr>
+          <w:ilvl w:val="0"/>
+          <w:numId w:val="1001"/>
+        </w:numPr>
+      </w:pPr>
+      <w:r>
+        <w:t xml:space="preserve">Avaliar o potencial do zooplâncton como bioindicador do estado ecológico de ambientes aquáticos temporários, considerando respostas da diversidade, da estrutura comunitária e da composição de espécies às variações ambientais.</w:t>
+      </w:r>
+    </w:p>
+    <w:p>
+      <w:pPr>
+        <w:numPr>
+          <w:ilvl w:val="0"/>
+          <w:numId w:val="1001"/>
+        </w:numPr>
+      </w:pPr>
+      <w:r>
+        <w:t xml:space="preserve">Caracterizar a composição taxonômica da comunidade zooplanctônica, visando compreender seus padrões de diversidade, variação espacial e temporal e os processos ecológicos que estruturam essa fauna em ecossistemas aquáticos temporários.</w:t>
+      </w:r>
+    </w:p>
+    <w:bookmarkEnd w:id="21"/>
+    <w:bookmarkStart w:id="26" w:name="material-and-methods"/>
+    <w:p>
+      <w:pPr>
+        <w:pStyle w:val="Ttulo1"/>
+      </w:pPr>
+      <w:r>
+        <w:t xml:space="preserve">3. Material and Methods</w:t>
       </w:r>
     </w:p>
     <w:p>
@@ -523,7 +600,7 @@
           <w:rPr>
             <w:rStyle w:val="Hyperlink"/>
           </w:rPr>
-          <w:t xml:space="preserve">Section 2.2</w:t>
+          <w:t xml:space="preserve">Section 3.2</w:t>
         </w:r>
       </w:hyperlink>
       <w:r>
@@ -545,13 +622,13 @@
         <w:t xml:space="preserve">).</w:t>
       </w:r>
     </w:p>
-    <w:bookmarkStart w:id="21" w:name="study-area-and-sampling-design"/>
+    <w:bookmarkStart w:id="22" w:name="study-area-and-sampling-design"/>
     <w:p>
       <w:pPr>
         <w:pStyle w:val="Ttulo2"/>
       </w:pPr>
       <w:r>
-        <w:t xml:space="preserve">2.1 Study Area and Sampling Design</w:t>
+        <w:t xml:space="preserve">3.1 Study Area and Sampling Design</w:t>
       </w:r>
     </w:p>
     <w:p>
@@ -559,6 +636,27 @@
         <w:pStyle w:val="FirstParagraph"/>
       </w:pPr>
       <w:r>
+        <w:t xml:space="preserve">O estudo foi realizado em uma lagoa temporária localizada no município de Lagoa Salgada, no estado do Rio Grande do Norte, região Nordeste do Brasil. O município possui uma área de aproximadamente 79,128 km² (IBGE, 2024). A região apresenta clima quente e semiárido, com temperatura média anual de 25,6 °C e regime pluviométrico concentrado entre os meses de março e junho (IBGE, 2024). As lagoas da área sofrem influência de ações antrópicas, como práticas agrícolas e a instalação de pequenas barragens, fatores que podem alterar a dinâmica hidrológica e as características ambientais desses ambientes aquáticos temporários (Ramos</w:t>
+      </w:r>
+      <w:r>
+        <w:t xml:space="preserve"> </w:t>
+      </w:r>
+      <w:r>
+        <w:rPr>
+          <w:i/>
+          <w:iCs/>
+        </w:rPr>
+        <w:t xml:space="preserve">et al</w:t>
+      </w:r>
+      <w:r>
+        <w:t xml:space="preserve">., 2023).</w:t>
+      </w:r>
+    </w:p>
+    <w:p>
+      <w:pPr>
+        <w:pStyle w:val="Corpodetexto"/>
+      </w:pPr>
+      <w:r>
         <w:t xml:space="preserve">See publications by</w:t>
       </w:r>
       <w:r>
@@ -571,14 +669,14 @@
         <w:t xml:space="preserve">.</w:t>
       </w:r>
     </w:p>
-    <w:bookmarkEnd w:id="21"/>
-    <w:bookmarkStart w:id="22" w:name="sec-data-col"/>
+    <w:bookmarkEnd w:id="22"/>
+    <w:bookmarkStart w:id="23" w:name="sec-data-col"/>
     <w:p>
       <w:pPr>
         <w:pStyle w:val="Ttulo2"/>
       </w:pPr>
       <w:r>
-        <w:t xml:space="preserve">2.2 Data Collection</w:t>
+        <w:t xml:space="preserve">3.2 Data Collection</w:t>
       </w:r>
     </w:p>
     <w:p>
@@ -598,14 +696,14 @@
         <w:t xml:space="preserve">.</w:t>
       </w:r>
     </w:p>
-    <w:bookmarkEnd w:id="22"/>
-    <w:bookmarkStart w:id="24" w:name="statistical-analyses"/>
+    <w:bookmarkEnd w:id="23"/>
+    <w:bookmarkStart w:id="25" w:name="statistical-analyses"/>
     <w:p>
       <w:pPr>
         <w:pStyle w:val="Ttulo2"/>
       </w:pPr>
       <w:r>
-        <w:t xml:space="preserve">2.3 Statistical Analyses</w:t>
+        <w:t xml:space="preserve">3.3 Statistical Analyses</w:t>
       </w:r>
     </w:p>
     <w:p>
@@ -618,7 +716,7 @@
       <w:r>
         <w:t xml:space="preserve"> </w:t>
       </w:r>
-      <w:hyperlink r:id="rId23">
+      <w:hyperlink r:id="rId24">
         <w:r>
           <w:rPr>
             <w:rStyle w:val="Hyperlink"/>
@@ -671,15 +769,15 @@
         <w:t xml:space="preserve">)</w:t>
       </w:r>
     </w:p>
-    <w:bookmarkEnd w:id="24"/>
     <w:bookmarkEnd w:id="25"/>
-    <w:bookmarkStart w:id="28" w:name="results"/>
+    <w:bookmarkEnd w:id="26"/>
+    <w:bookmarkStart w:id="29" w:name="results"/>
     <w:p>
       <w:pPr>
         <w:pStyle w:val="Ttulo1"/>
       </w:pPr>
       <w:r>
-        <w:t xml:space="preserve">3. Results</w:t>
+        <w:t xml:space="preserve">4. Results</w:t>
       </w:r>
     </w:p>
     <w:p>
@@ -692,7 +790,7 @@
       <w:r>
         <w:t xml:space="preserve"> </w:t>
       </w:r>
-      <w:hyperlink r:id="rId23">
+      <w:hyperlink r:id="rId24">
         <w:r>
           <w:rPr>
             <w:rStyle w:val="Hyperlink"/>
@@ -704,38 +802,38 @@
         <w:t xml:space="preserve">.</w:t>
       </w:r>
     </w:p>
-    <w:bookmarkStart w:id="26" w:name="environmental-variables"/>
+    <w:bookmarkStart w:id="27" w:name="environmental-variables"/>
     <w:p>
       <w:pPr>
         <w:pStyle w:val="Ttulo2"/>
       </w:pPr>
       <w:r>
-        <w:t xml:space="preserve">3.1 Environmental variables</w:t>
-      </w:r>
-    </w:p>
-    <w:bookmarkEnd w:id="26"/>
-    <w:bookmarkStart w:id="27" w:name="community-structure"/>
+        <w:t xml:space="preserve">4.1 Environmental variables</w:t>
+      </w:r>
+    </w:p>
+    <w:bookmarkEnd w:id="27"/>
+    <w:bookmarkStart w:id="28" w:name="community-structure"/>
     <w:p>
       <w:pPr>
         <w:pStyle w:val="Ttulo2"/>
       </w:pPr>
       <w:r>
-        <w:t xml:space="preserve">3.2 Community structure</w:t>
-      </w:r>
-    </w:p>
-    <w:bookmarkEnd w:id="27"/>
+        <w:t xml:space="preserve">4.2 Community structure</w:t>
+      </w:r>
+    </w:p>
     <w:bookmarkEnd w:id="28"/>
-    <w:bookmarkStart w:id="29" w:name="discussion"/>
+    <w:bookmarkEnd w:id="29"/>
+    <w:bookmarkStart w:id="30" w:name="discussion"/>
     <w:p>
       <w:pPr>
         <w:pStyle w:val="Ttulo1"/>
       </w:pPr>
       <w:r>
-        <w:t xml:space="preserve">4. Discussion</w:t>
-      </w:r>
-    </w:p>
-    <w:bookmarkEnd w:id="29"/>
-    <w:bookmarkStart w:id="30" w:name="conclusions"/>
+        <w:t xml:space="preserve">5. Discussion</w:t>
+      </w:r>
+    </w:p>
+    <w:bookmarkEnd w:id="30"/>
+    <w:bookmarkStart w:id="31" w:name="conclusions"/>
     <w:p>
       <w:pPr>
         <w:pStyle w:val="Ttulo1"/>
@@ -744,8 +842,8 @@
         <w:t xml:space="preserve">Conclusions</w:t>
       </w:r>
     </w:p>
-    <w:bookmarkEnd w:id="30"/>
-    <w:bookmarkStart w:id="31" w:name="acknowledgements"/>
+    <w:bookmarkEnd w:id="31"/>
+    <w:bookmarkStart w:id="32" w:name="acknowledgements"/>
     <w:p>
       <w:pPr>
         <w:pStyle w:val="Ttulo1"/>
@@ -754,8 +852,8 @@
         <w:t xml:space="preserve">Acknowledgements</w:t>
       </w:r>
     </w:p>
-    <w:bookmarkEnd w:id="31"/>
-    <w:bookmarkStart w:id="32" w:name="authorship-contribution-statement"/>
+    <w:bookmarkEnd w:id="32"/>
+    <w:bookmarkStart w:id="33" w:name="authorship-contribution-statement"/>
     <w:p>
       <w:pPr>
         <w:pStyle w:val="Ttulo1"/>
@@ -789,8 +887,8 @@
         <w:t xml:space="preserve">Author1: Writing – review &amp; editing, Writing – original draft, Formal analysis, Data curation, Conceptualization. Author2: Writing – review &amp; editing, Data curation, Conceptualization. Author3: Writing – review &amp; editing, Formal analysis, Data curation, Conceptualization.</w:t>
       </w:r>
     </w:p>
-    <w:bookmarkEnd w:id="32"/>
-    <w:bookmarkStart w:id="33" w:name="ethical-approval"/>
+    <w:bookmarkEnd w:id="33"/>
+    <w:bookmarkStart w:id="34" w:name="ethical-approval"/>
     <w:p>
       <w:pPr>
         <w:pStyle w:val="Ttulo1"/>
@@ -807,8 +905,8 @@
         <w:t xml:space="preserve">This study did not require ethical approval as it did not involve human participants or sensitive data. Field surveys were conducted based on collection permit number (IEF-10327-6 and SISBIO-10.635-7).</w:t>
       </w:r>
     </w:p>
-    <w:bookmarkEnd w:id="33"/>
-    <w:bookmarkStart w:id="42" w:name="references"/>
+    <w:bookmarkEnd w:id="34"/>
+    <w:bookmarkStart w:id="45" w:name="references"/>
     <w:p>
       <w:pPr>
         <w:pStyle w:val="Ttulo1"/>
@@ -817,8 +915,8 @@
         <w:t xml:space="preserve">References</w:t>
       </w:r>
     </w:p>
-    <w:bookmarkStart w:id="41" w:name="refs"/>
-    <w:bookmarkStart w:id="35" w:name="ref-credit2026"/>
+    <w:bookmarkStart w:id="44" w:name="refs"/>
+    <w:bookmarkStart w:id="36" w:name="ref-credit2026"/>
     <w:p>
       <w:pPr>
         <w:pStyle w:val="Bibliografia"/>
@@ -842,7 +940,7 @@
       <w:r>
         <w:t xml:space="preserve"> </w:t>
       </w:r>
-      <w:hyperlink r:id="rId34">
+      <w:hyperlink r:id="rId35">
         <w:r>
           <w:rPr>
             <w:rStyle w:val="Hyperlink"/>
@@ -851,8 +949,8 @@
         </w:r>
       </w:hyperlink>
     </w:p>
-    <w:bookmarkEnd w:id="35"/>
-    <w:bookmarkStart w:id="37" w:name="ref-gouveia2017"/>
+    <w:bookmarkEnd w:id="36"/>
+    <w:bookmarkStart w:id="38" w:name="ref-gouveia2017"/>
     <w:p>
       <w:pPr>
         <w:pStyle w:val="Bibliografia"/>
@@ -889,7 +987,7 @@
       <w:r>
         <w:t xml:space="preserve"> </w:t>
       </w:r>
-      <w:hyperlink r:id="rId36">
+      <w:hyperlink r:id="rId37">
         <w:r>
           <w:rPr>
             <w:rStyle w:val="Hyperlink"/>
@@ -898,8 +996,8 @@
         </w:r>
       </w:hyperlink>
     </w:p>
-    <w:bookmarkEnd w:id="37"/>
-    <w:bookmarkStart w:id="39" w:name="ref-macêdo2019"/>
+    <w:bookmarkEnd w:id="38"/>
+    <w:bookmarkStart w:id="40" w:name="ref-macêdo2019"/>
     <w:p>
       <w:pPr>
         <w:pStyle w:val="Bibliografia"/>
@@ -942,7 +1040,7 @@
       <w:r>
         <w:t xml:space="preserve"> </w:t>
       </w:r>
-      <w:hyperlink r:id="rId38">
+      <w:hyperlink r:id="rId39">
         <w:r>
           <w:rPr>
             <w:rStyle w:val="Hyperlink"/>
@@ -951,8 +1049,8 @@
         </w:r>
       </w:hyperlink>
     </w:p>
-    <w:bookmarkEnd w:id="39"/>
-    <w:bookmarkStart w:id="40" w:name="ref-medeiros2008"/>
+    <w:bookmarkEnd w:id="40"/>
+    <w:bookmarkStart w:id="41" w:name="ref-medeiros2008"/>
     <w:p>
       <w:pPr>
         <w:pStyle w:val="Bibliografia"/>
@@ -987,10 +1085,57 @@
         <w:t xml:space="preserve">(1), 13–20.</w:t>
       </w:r>
     </w:p>
-    <w:bookmarkEnd w:id="40"/>
     <w:bookmarkEnd w:id="41"/>
-    <w:bookmarkEnd w:id="42"/>
-    <w:bookmarkStart w:id="49" w:name="figures-and-tables"/>
+    <w:bookmarkStart w:id="43" w:name="ref-melo2013"/>
+    <w:p>
+      <w:pPr>
+        <w:pStyle w:val="Bibliografia"/>
+      </w:pPr>
+      <w:r>
+        <w:t xml:space="preserve">Melo, T. X., &amp; Medeiros, E. S. F. (2013). Spatial Distribution of Zooplankton Diversity across Temporary Pools in a Semiarid Intermittent River.</w:t>
+      </w:r>
+      <w:r>
+        <w:t xml:space="preserve"> </w:t>
+      </w:r>
+      <w:r>
+        <w:rPr>
+          <w:i/>
+          <w:iCs/>
+        </w:rPr>
+        <w:t xml:space="preserve">International Journal of Biodiversity</w:t>
+      </w:r>
+      <w:r>
+        <w:t xml:space="preserve">,</w:t>
+      </w:r>
+      <w:r>
+        <w:t xml:space="preserve"> </w:t>
+      </w:r>
+      <w:r>
+        <w:rPr>
+          <w:i/>
+          <w:iCs/>
+        </w:rPr>
+        <w:t xml:space="preserve">2013</w:t>
+      </w:r>
+      <w:r>
+        <w:t xml:space="preserve">, 1–13.</w:t>
+      </w:r>
+      <w:r>
+        <w:t xml:space="preserve"> </w:t>
+      </w:r>
+      <w:hyperlink r:id="rId42">
+        <w:r>
+          <w:rPr>
+            <w:rStyle w:val="Hyperlink"/>
+          </w:rPr>
+          <w:t xml:space="preserve">https://doi.org/10.1155/2013/946361</w:t>
+        </w:r>
+      </w:hyperlink>
+    </w:p>
+    <w:bookmarkEnd w:id="43"/>
+    <w:bookmarkEnd w:id="44"/>
+    <w:bookmarkEnd w:id="45"/>
+    <w:bookmarkStart w:id="52" w:name="figures-and-tables"/>
     <w:p>
       <w:pPr>
         <w:pStyle w:val="Ttulo1"/>
@@ -999,7 +1144,7 @@
         <w:t xml:space="preserve">Figures and Tables</w:t>
       </w:r>
     </w:p>
-    <w:bookmarkStart w:id="47" w:name="figures"/>
+    <w:bookmarkStart w:id="50" w:name="figures"/>
     <w:p>
       <w:pPr>
         <w:pStyle w:val="Ttulo2"/>
@@ -1021,7 +1166,7 @@
       <w:tr>
         <w:tc>
           <w:tcPr/>
-          <w:bookmarkStart w:id="46" w:name="fig-pesquisa"/>
+          <w:bookmarkStart w:id="49" w:name="fig-pesquisa"/>
           <w:p>
             <w:pPr>
               <w:pStyle w:val="Compact"/>
@@ -1032,18 +1177,18 @@
                 <wp:inline>
                   <wp:extent cx="4107179" cy="3886200"/>
                   <wp:effectExtent b="0" l="0" r="0" t="0"/>
-                  <wp:docPr descr="" title="" id="44" name="Picture"/>
+                  <wp:docPr descr="" title="" id="47" name="Picture"/>
                   <a:graphic>
                     <a:graphicData uri="http://schemas.openxmlformats.org/drawingml/2006/picture">
                       <pic:pic>
                         <pic:nvPicPr>
-                          <pic:cNvPr descr="imagens/pesquisa_cientifica.jpg" id="45" name="Picture"/>
+                          <pic:cNvPr descr="imagens/pesquisa_cientifica.jpg" id="48" name="Picture"/>
                           <pic:cNvPicPr>
                             <a:picLocks noChangeArrowheads="1" noChangeAspect="1"/>
                           </pic:cNvPicPr>
                         </pic:nvPicPr>
                         <pic:blipFill>
-                          <a:blip r:embed="rId43"/>
+                          <a:blip r:embed="rId46"/>
                           <a:stretch>
                             <a:fillRect/>
                           </a:stretch>
@@ -1083,12 +1228,12 @@
               <w:t xml:space="preserve">Figure 1: Etapas do desenvolvimento da pesquisa científica.</w:t>
             </w:r>
           </w:p>
-          <w:bookmarkEnd w:id="46"/>
+          <w:bookmarkEnd w:id="49"/>
         </w:tc>
       </w:tr>
     </w:tbl>
-    <w:bookmarkEnd w:id="47"/>
-    <w:bookmarkStart w:id="48" w:name="tables"/>
+    <w:bookmarkEnd w:id="50"/>
+    <w:bookmarkStart w:id="51" w:name="tables"/>
     <w:p>
       <w:pPr>
         <w:pStyle w:val="Ttulo2"/>
@@ -1097,9 +1242,9 @@
         <w:t xml:space="preserve">Tables</w:t>
       </w:r>
     </w:p>
-    <w:bookmarkEnd w:id="48"/>
-    <w:bookmarkEnd w:id="49"/>
-    <w:bookmarkStart w:id="50" w:name="apendices"/>
+    <w:bookmarkEnd w:id="51"/>
+    <w:bookmarkEnd w:id="52"/>
+    <w:bookmarkStart w:id="53" w:name="apendices"/>
     <w:p>
       <w:pPr>
         <w:pStyle w:val="Ttulo1"/>
@@ -1108,8 +1253,8 @@
         <w:t xml:space="preserve">Apendices</w:t>
       </w:r>
     </w:p>
-    <w:bookmarkEnd w:id="50"/>
-    <w:bookmarkStart w:id="54" w:name="non-used-figures-and-tables"/>
+    <w:bookmarkEnd w:id="53"/>
+    <w:bookmarkStart w:id="57" w:name="non-used-figures-and-tables"/>
     <w:p>
       <w:pPr>
         <w:pStyle w:val="Ttulo1"/>
@@ -1159,18 +1304,18 @@
                 <wp:inline>
                   <wp:extent cx="152400" cy="152400"/>
                   <wp:effectExtent b="0" l="0" r="0" t="0"/>
-                  <wp:docPr descr="" title="" id="52" name="Picture"/>
+                  <wp:docPr descr="" title="" id="55" name="Picture"/>
                   <a:graphic>
                     <a:graphicData uri="http://schemas.openxmlformats.org/drawingml/2006/picture">
                       <pic:pic>
                         <pic:nvPicPr>
-                          <pic:cNvPr descr="C:\PROGRA~1\RStudio\RESOUR~1\app\bin\quarto\share\formats\docx\warning.png" id="53" name="Picture"/>
+                          <pic:cNvPr descr="C:\PROGRA~1\RStudio\RESOUR~1\app\bin\quarto\share\formats\docx\warning.png" id="56" name="Picture"/>
                           <pic:cNvPicPr>
                             <a:picLocks noChangeArrowheads="1" noChangeAspect="1"/>
                           </pic:cNvPicPr>
                         </pic:nvPicPr>
                         <pic:blipFill>
-                          <a:blip r:embed="rId51"/>
+                          <a:blip r:embed="rId54"/>
                           <a:stretch>
                             <a:fillRect/>
                           </a:stretch>
@@ -1223,7 +1368,7 @@
         </w:tc>
       </w:tr>
     </w:tbl>
-    <w:bookmarkEnd w:id="54"/>
+    <w:bookmarkEnd w:id="57"/>
     <w:sectPr>
       <w:pgSz w:h="15840" w:w="12240"/>
       <w:pgMar w:bottom="1417" w:footer="720" w:gutter="0" w:header="720" w:left="1701" w:right="1701" w:top="1417"/>
@@ -1438,11 +1583,126 @@
       </w:pPr>
     </w:lvl>
   </w:abstractNum>
+  <w:abstractNum w:abstractNumId="99411">
+    <w:nsid w:val="00A99411"/>
+    <w:multiLevelType w:val="multilevel"/>
+    <w:lvl w:ilvl="0">
+      <w:start w:val="1"/>
+      <w:numFmt w:val="decimal"/>
+      <w:lvlText w:val="%1."/>
+      <w:lvlJc w:val="left"/>
+      <w:pPr>
+        <w:ind w:left="720" w:hanging="360"/>
+      </w:pPr>
+    </w:lvl>
+    <w:lvl w:ilvl="1">
+      <w:start w:val="1"/>
+      <w:numFmt w:val="decimal"/>
+      <w:lvlText w:val="%2."/>
+      <w:lvlJc w:val="left"/>
+      <w:pPr>
+        <w:ind w:left="1440" w:hanging="360"/>
+      </w:pPr>
+    </w:lvl>
+    <w:lvl w:ilvl="2">
+      <w:start w:val="1"/>
+      <w:numFmt w:val="decimal"/>
+      <w:lvlText w:val="%3."/>
+      <w:lvlJc w:val="left"/>
+      <w:pPr>
+        <w:ind w:left="2160" w:hanging="360"/>
+      </w:pPr>
+    </w:lvl>
+    <w:lvl w:ilvl="3">
+      <w:start w:val="1"/>
+      <w:numFmt w:val="decimal"/>
+      <w:lvlText w:val="%4."/>
+      <w:lvlJc w:val="left"/>
+      <w:pPr>
+        <w:ind w:left="2880" w:hanging="360"/>
+      </w:pPr>
+    </w:lvl>
+    <w:lvl w:ilvl="4">
+      <w:start w:val="1"/>
+      <w:numFmt w:val="decimal"/>
+      <w:lvlText w:val="%5."/>
+      <w:lvlJc w:val="left"/>
+      <w:pPr>
+        <w:ind w:left="3600" w:hanging="360"/>
+      </w:pPr>
+    </w:lvl>
+    <w:lvl w:ilvl="5">
+      <w:start w:val="1"/>
+      <w:numFmt w:val="decimal"/>
+      <w:lvlText w:val="%6."/>
+      <w:lvlJc w:val="left"/>
+      <w:pPr>
+        <w:ind w:left="4320" w:hanging="360"/>
+      </w:pPr>
+    </w:lvl>
+    <w:lvl w:ilvl="6">
+      <w:start w:val="1"/>
+      <w:numFmt w:val="decimal"/>
+      <w:lvlText w:val="%7."/>
+      <w:lvlJc w:val="left"/>
+      <w:pPr>
+        <w:ind w:left="5040" w:hanging="360"/>
+      </w:pPr>
+    </w:lvl>
+    <w:lvl w:ilvl="7">
+      <w:start w:val="1"/>
+      <w:numFmt w:val="decimal"/>
+      <w:lvlText w:val="%8."/>
+      <w:lvlJc w:val="left"/>
+      <w:pPr>
+        <w:ind w:left="5760" w:hanging="360"/>
+      </w:pPr>
+    </w:lvl>
+    <w:lvl w:ilvl="8">
+      <w:start w:val="1"/>
+      <w:numFmt w:val="decimal"/>
+      <w:lvlText w:val="%9."/>
+      <w:lvlJc w:val="left"/>
+      <w:pPr>
+        <w:ind w:left="6480" w:hanging="360"/>
+      </w:pPr>
+    </w:lvl>
+  </w:abstractNum>
   <w:num w16cid:durableId="152186097" w:numId="1">
     <w:abstractNumId w:val="0"/>
   </w:num>
   <w:num w:numId="1000">
     <w:abstractNumId w:val="990"/>
+  </w:num>
+  <w:num w:numId="1001">
+    <w:abstractNumId w:val="99411"/>
+    <w:lvlOverride w:ilvl="0">
+      <w:startOverride w:val="1"/>
+    </w:lvlOverride>
+    <w:lvlOverride w:ilvl="1">
+      <w:startOverride w:val="1"/>
+    </w:lvlOverride>
+    <w:lvlOverride w:ilvl="2">
+      <w:startOverride w:val="1"/>
+    </w:lvlOverride>
+    <w:lvlOverride w:ilvl="3">
+      <w:startOverride w:val="1"/>
+    </w:lvlOverride>
+    <w:lvlOverride w:ilvl="4">
+      <w:startOverride w:val="1"/>
+    </w:lvlOverride>
+    <w:lvlOverride w:ilvl="5">
+      <w:startOverride w:val="1"/>
+    </w:lvlOverride>
+    <w:lvlOverride w:ilvl="6">
+      <w:startOverride w:val="1"/>
+    </w:lvlOverride>
+    <w:lvlOverride w:ilvl="7">
+      <w:startOverride w:val="1"/>
+    </w:lvlOverride>
+    <w:lvlOverride w:ilvl="8">
+      <w:startOverride w:val="1"/>
+    </w:lvlOverride>
   </w:num>
 </w:numbering>
 </file>

</xml_diff>